<commit_message>
docs: el certificado en Robótica e IA va como certificación, no como ramo
Edgar aclaró que Robótica e Inteligencia Artificial es un certificado de
competencia que obtuvo, no una asignatura. La pauta pregunta literalmente
por "asignaturas o certificados de competencias" y dedica una pregunta
al valor de las certificaciones obtenidas, así que el certificado se
nombra en las dos respuestas y ancla el argumento general en un caso
propio.

Co-Authored-By: Claude Opus 5 (1M context) <noreply@anthropic.com>
Claude-Session: https://claude.ai/code/session_01Rvh88dkfXqgVzQiFw1YokL
</commit_message>
<xml_diff>
--- a/Fase 1/Evidencias Individuales/Tolentino_Edgar_1.2_APT122_DiarioReflexionFase1.docx
+++ b/Fase 1/Evidencias Individuales/Tolentino_Edgar_1.2_APT122_DiarioReflexionFase1.docx
@@ -564,7 +564,7 @@
                 <w:color w:val="1C1C1C"/>
                 <w:sz w:val="20"/>
               </w:rPr>
-              <w:t>Las asignaturas que más me marcaron fueron Desarrollo Web, Base de Datos 1 y 2, Big Data, Robótica e Inteligencia Artificial y el Portafolio de Título. De Desarrollo Web me gustó que el resultado se ve funcionando y se puede mejorar con pruebas; de Base de Datos y Big Data, que un buen modelo simplifica todo lo que viene después y que el volumen del dato cambia las decisiones de diseño; de Robótica e Inteligencia Artificial, que un modelo solo sirve cuando se conecta con el mundo real; y del Portafolio de Título, que un plan con horas y responsables es lo que hace que un equipo entregue.</w:t>
+              <w:t>Las asignaturas que más me marcaron fueron Desarrollo Web, Base de Datos 1 y 2, Big Data y el Portafolio de Título; y entre los certificados de competencia, el de Robótica e Inteligencia Artificial. De Desarrollo Web me gustó que el resultado se ve funcionando y se puede mejorar con pruebas; de Base de Datos y Big Data, que un buen modelo simplifica todo lo que viene después y que el volumen del dato cambia las decisiones de diseño; del certificado en Robótica e Inteligencia Artificial, que un modelo solo sirve cuando se conecta con el mundo real; y del Portafolio de Título, que un plan con horas y responsables es lo que hace que un equipo entregue.</w:t>
             </w:r>
           </w:p>
           <w:p>
@@ -588,7 +588,7 @@
                 <w:color w:val="1C1C1C"/>
                 <w:sz w:val="20"/>
               </w:rPr>
-              <w:t>Sí tienen valor, por dos razones. Obligan a demostrar un resultado concreto y evaluable, no solo a aprobar contenidos, y son legibles para un empleador. Su valor real, en todo caso, depende de usarlas en un contexto: en mi caso, el trabajo como Ingeniero de Proyectos en una consultora de seguridad y gestión vial es donde esas competencias se convirtieron en herramientas que la empresa usa todos los días.</w:t>
+              <w:t>Sí tienen valor, por dos razones. Obligan a demostrar un resultado concreto y evaluable, no solo a aprobar contenidos, y son legibles para un empleador. El certificado en Robótica e Inteligencia Artificial es mi mejor ejemplo: es el antecedente formal más cercano al proyecto que estoy construyendo. Su valor real, en todo caso, depende de usarlas en un contexto: en mi caso, el trabajo como Ingeniero de Proyectos en una consultora de seguridad y gestión vial es donde esas competencias se convirtieron en herramientas que la empresa usa todos los días.</w:t>
             </w:r>
           </w:p>
         </w:tc>

</xml_diff>